<commit_message>
Add Council->DOCX bridge; embed real DAN logo on all documents
- integrations/: council_client.py (extract->Council->markdown),
  render_docx.cjs (constrained markdown -> branded .docx via dan_template.js),
  run_all.py orchestrator, manifest.json, README. Render half verified end-to-end
  (schema-valid output); Council half ready (needs OPENROUTER_API_KEY).
- Embedded the real DAN colored logo on every cover; rebuilt all five R00
  documents. All schema-validated.

Co-Authored-By: Claude Opus 4.8 <noreply@anthropic.com>
Claude-Session: https://claude.ai/code/session_01Gkd3K8tDngLcQLDrM4dcJc
</commit_message>
<xml_diff>
--- a/New HSSE Management System 2026/05-Support/01-000001-000000-DAN-PRC-HSE-000004-QULF_R00.docx
+++ b/New HSSE Management System 2026/05-Support/01-000001-000000-DAN-PRC-HSE-000004-QULF_R00.docx
@@ -4,32 +4,47 @@
   <w:body>
     <w:p>
       <w:pPr>
-        <w:spacing w:after="60"/>
-      </w:pPr>
-      <w:r>
-        <w:rPr>
-          <w:rFonts w:ascii="Tahoma" w:cs="Tahoma" w:eastAsia="Tahoma" w:hAnsi="Tahoma"/>
-          <w:b/>
-          <w:bCs/>
-          <w:color w:val="542A12"/>
-          <w:sz w:val="64"/>
-          <w:szCs w:val="64"/>
-        </w:rPr>
-        <w:t xml:space="preserve">DAN</w:t>
-      </w:r>
-    </w:p>
-    <w:p>
-      <w:pPr>
         <w:spacing w:after="240"/>
       </w:pPr>
       <w:r>
-        <w:rPr>
-          <w:rFonts w:ascii="Tahoma" w:cs="Tahoma" w:eastAsia="Tahoma" w:hAnsi="Tahoma"/>
-          <w:color w:val="542A12"/>
-          <w:sz w:val="18"/>
-          <w:szCs w:val="18"/>
-        </w:rPr>
-        <w:t xml:space="preserve">C O M P A N Y</w:t>
+        <w:drawing>
+          <wp:inline distT="0" distB="0" distL="0" distR="0">
+            <wp:extent cx="1428750" cy="1104900"/>
+            <wp:effectExtent t="0" r="0" b="0" l="0"/>
+            <wp:docPr id="1" name="DAN" descr="DAN Company logo" title="DAN"/>
+            <wp:cNvGraphicFramePr>
+              <a:graphicFrameLocks xmlns:a="http://schemas.openxmlformats.org/drawingml/2006/main" noChangeAspect="1"/>
+            </wp:cNvGraphicFramePr>
+            <a:graphic xmlns:a="http://schemas.openxmlformats.org/drawingml/2006/main">
+              <a:graphicData uri="http://schemas.openxmlformats.org/drawingml/2006/picture">
+                <pic:pic xmlns:pic="http://schemas.openxmlformats.org/drawingml/2006/picture">
+                  <pic:nvPicPr>
+                    <pic:cNvPr id="0" name="" descr=""/>
+                    <pic:cNvPicPr>
+                      <a:picLocks noChangeAspect="1" noChangeArrowheads="1"/>
+                    </pic:cNvPicPr>
+                  </pic:nvPicPr>
+                  <pic:blipFill>
+                    <a:blip r:embed="rId9" cstate="none"/>
+                    <a:srcRect/>
+                    <a:stretch>
+                      <a:fillRect/>
+                    </a:stretch>
+                  </pic:blipFill>
+                  <pic:spPr bwMode="auto">
+                    <a:xfrm>
+                      <a:off x="0" y="0"/>
+                      <a:ext cx="1428750" cy="1104900"/>
+                    </a:xfrm>
+                    <a:prstGeom prst="rect">
+                      <a:avLst/>
+                    </a:prstGeom>
+                  </pic:spPr>
+                </pic:pic>
+              </a:graphicData>
+            </a:graphic>
+          </wp:inline>
+        </w:drawing>
       </w:r>
     </w:p>
     <w:tbl>

</xml_diff>